<commit_message>
L6 dollars and notes: teach slides, workbook Q7, play notes cut-out; remove × from keys and qbank; L10 diagram fix; L7/L8 decks rebuilt
Co-Authored-By: Claude Opus 5.5 <noreply@anthropic.com>
Claude-Session: https://claude.ai/code/session_01NYgB3ju57UwWRpkPPM6X7F
</commit_message>
<xml_diff>
--- a/outputs/workbook/Math_Inquirers_P1_Student_Workbook.docx
+++ b/outputs/workbook/Math_Inquirers_P1_Student_Workbook.docx
@@ -15551,7 +15551,7 @@
           <w:sz w:val="26"/>
           <w:szCs w:val="26"/>
         </w:rPr>
-        <w:t xml:space="preserve">Challenge! Find ALL the ways to make 30¢ using 20¢, 10¢ and 5¢ coins. Write each way like this:  1 × 20¢ + 2 × 5¢</w:t>
+        <w:t xml:space="preserve">Challenge! Find ALL the ways to make 30¢ using 20¢, 10¢ and 5¢ coins. Write each way like this:  20¢ + 5¢ + 5¢</w:t>
       </w:r>
     </w:p>
     <w:p>
@@ -15960,6 +15960,185 @@
           <w:szCs w:val="26"/>
         </w:rPr>
         <w:t xml:space="preserve">Can Sam pay 90¢ using exactly 4 coins? Explain.</w:t>
+      </w:r>
+    </w:p>
+    <w:p>
+      <w:pPr>
+        <w:pBdr>
+          <w:bottom w:val="single" w:color="777777" w:sz="6" w:space="1"/>
+        </w:pBdr>
+        <w:spacing w:after="80" w:before="280"/>
+        <w:ind w:left="560"/>
+      </w:pPr>
+    </w:p>
+    <w:p>
+      <w:pPr>
+        <w:pBdr>
+          <w:bottom w:val="single" w:color="777777" w:sz="6" w:space="1"/>
+        </w:pBdr>
+        <w:spacing w:after="80" w:before="280"/>
+        <w:ind w:left="560"/>
+      </w:pPr>
+    </w:p>
+    <w:p>
+      <w:pPr>
+        <w:keepNext/>
+        <w:keepLines/>
+        <w:spacing w:after="120" w:before="160" w:line="320" w:lineRule="auto"/>
+        <w:ind w:left="560" w:hanging="560"/>
+      </w:pPr>
+      <w:r>
+        <w:rPr>
+          <w:rFonts w:ascii="Arial" w:cs="Arial" w:eastAsia="Arial" w:hAnsi="Arial"/>
+          <w:b/>
+          <w:bCs/>
+          <w:sz w:val="26"/>
+          <w:szCs w:val="26"/>
+        </w:rPr>
+        <w:t xml:space="preserve">7.</w:t>
+      </w:r>
+      <w:r>
+        <w:rPr>
+          <w:rFonts w:ascii="Arial" w:cs="Arial" w:eastAsia="Arial" w:hAnsi="Arial"/>
+          <w:sz w:val="26"/>
+          <w:szCs w:val="26"/>
+        </w:rPr>
+        <w:tab/>
+      </w:r>
+      <w:r>
+        <w:rPr>
+          <w:rFonts w:ascii="Arial" w:cs="Arial" w:eastAsia="Arial" w:hAnsi="Arial"/>
+          <w:sz w:val="26"/>
+          <w:szCs w:val="26"/>
+        </w:rPr>
+        <w:t xml:space="preserve">Dollars! We also have $1 coins and $2, $5, $10 and $50 notes.</w:t>
+      </w:r>
+    </w:p>
+    <w:p>
+      <w:pPr>
+        <w:keepLines/>
+        <w:spacing w:after="120" w:before="0" w:line="320" w:lineRule="auto"/>
+        <w:ind w:left="1000" w:hanging="440"/>
+      </w:pPr>
+      <w:r>
+        <w:rPr>
+          <w:rFonts w:ascii="Arial" w:cs="Arial" w:eastAsia="Arial" w:hAnsi="Arial"/>
+          <w:b/>
+          <w:bCs/>
+          <w:sz w:val="26"/>
+          <w:szCs w:val="26"/>
+        </w:rPr>
+        <w:t xml:space="preserve">(a)  </w:t>
+      </w:r>
+      <w:r>
+        <w:rPr>
+          <w:rFonts w:ascii="Arial" w:cs="Arial" w:eastAsia="Arial" w:hAnsi="Arial"/>
+          <w:sz w:val="26"/>
+          <w:szCs w:val="26"/>
+        </w:rPr>
+        <w:t xml:space="preserve">A toy costs $17. Pay exactly with the fewest notes and coins.</w:t>
+      </w:r>
+    </w:p>
+    <w:p>
+      <w:pPr>
+        <w:keepLines/>
+        <w:spacing w:after="140" w:before="0" w:line="320" w:lineRule="auto"/>
+        <w:ind w:left="1000"/>
+      </w:pPr>
+      <w:r>
+        <w:rPr>
+          <w:rFonts w:ascii="Arial" w:cs="Arial" w:eastAsia="Arial" w:hAnsi="Arial"/>
+          <w:b/>
+          <w:bCs/>
+          <w:sz w:val="26"/>
+          <w:szCs w:val="26"/>
+        </w:rPr>
+        <w:t xml:space="preserve">Answer: </w:t>
+      </w:r>
+      <w:r>
+        <w:rPr>
+          <w:rFonts w:ascii="Arial" w:cs="Arial" w:eastAsia="Arial" w:hAnsi="Arial"/>
+          <w:sz w:val="26"/>
+          <w:szCs w:val="26"/>
+        </w:rPr>
+        <w:t xml:space="preserve">______________________________</w:t>
+      </w:r>
+    </w:p>
+    <w:p>
+      <w:pPr>
+        <w:keepLines/>
+        <w:spacing w:after="120" w:before="0" w:line="320" w:lineRule="auto"/>
+        <w:ind w:left="1000" w:hanging="440"/>
+      </w:pPr>
+      <w:r>
+        <w:rPr>
+          <w:rFonts w:ascii="Arial" w:cs="Arial" w:eastAsia="Arial" w:hAnsi="Arial"/>
+          <w:b/>
+          <w:bCs/>
+          <w:sz w:val="26"/>
+          <w:szCs w:val="26"/>
+        </w:rPr>
+        <w:t xml:space="preserve">(b)  </w:t>
+      </w:r>
+      <w:r>
+        <w:rPr>
+          <w:rFonts w:ascii="Arial" w:cs="Arial" w:eastAsia="Arial" w:hAnsi="Arial"/>
+          <w:sz w:val="26"/>
+          <w:szCs w:val="26"/>
+        </w:rPr>
+        <w:t xml:space="preserve">Show 3 different ways to pay exactly $20.</w:t>
+      </w:r>
+    </w:p>
+    <w:p>
+      <w:pPr>
+        <w:pBdr>
+          <w:bottom w:val="single" w:color="777777" w:sz="6" w:space="1"/>
+        </w:pBdr>
+        <w:spacing w:after="80" w:before="280"/>
+        <w:ind w:left="560"/>
+      </w:pPr>
+    </w:p>
+    <w:p>
+      <w:pPr>
+        <w:pBdr>
+          <w:bottom w:val="single" w:color="777777" w:sz="6" w:space="1"/>
+        </w:pBdr>
+        <w:spacing w:after="80" w:before="280"/>
+        <w:ind w:left="560"/>
+      </w:pPr>
+    </w:p>
+    <w:p>
+      <w:pPr>
+        <w:pBdr>
+          <w:bottom w:val="single" w:color="777777" w:sz="6" w:space="1"/>
+        </w:pBdr>
+        <w:spacing w:after="80" w:before="280"/>
+        <w:ind w:left="560"/>
+      </w:pPr>
+    </w:p>
+    <w:p>
+      <w:pPr>
+        <w:keepLines/>
+        <w:spacing w:after="120" w:before="0" w:line="320" w:lineRule="auto"/>
+        <w:ind w:left="1000" w:hanging="440"/>
+      </w:pPr>
+      <w:r>
+        <w:rPr>
+          <w:rFonts w:ascii="Arial" w:cs="Arial" w:eastAsia="Arial" w:hAnsi="Arial"/>
+          <w:b/>
+          <w:bCs/>
+          <w:sz w:val="26"/>
+          <w:szCs w:val="26"/>
+        </w:rPr>
+        <w:t xml:space="preserve">(c)  </w:t>
+      </w:r>
+      <w:r>
+        <w:rPr>
+          <w:rFonts w:ascii="Arial" w:cs="Arial" w:eastAsia="Arial" w:hAnsi="Arial"/>
+          <w:sz w:val="26"/>
+          <w:szCs w:val="26"/>
+        </w:rPr>
+        <w:t xml:space="preserve">Mei has one $50 note and two $10 notes. A bicycle costs $65 and a helmet costs $8. Does she have enough money for both? Explain.</w:t>
       </w:r>
     </w:p>
     <w:p>
@@ -21511,7 +21690,7 @@
           <w:sz w:val="26"/>
           <w:szCs w:val="26"/>
         </w:rPr>
-        <w:t xml:space="preserve">Numbers 1 to 12. Which are multiples of 2? Which are multiples of 3? Which are both?</w:t>
+        <w:t xml:space="preserve">Numbers 1 to 12. Which do we say when counting in 2s? Which when counting in 3s? Which in both?</w:t>
       </w:r>
     </w:p>
     <w:p>
@@ -21862,7 +22041,7 @@
           <w:sz w:val="26"/>
           <w:szCs w:val="26"/>
         </w:rPr>
-        <w:t xml:space="preserve">Numbers 1 to 20. How many are multiples of 2 only, 3 only, both, and neither?</w:t>
+        <w:t xml:space="preserve">Numbers 1 to 20. How many do we say only when counting in 2s, only in 3s, in both, and in neither?</w:t>
       </w:r>
     </w:p>
     <w:p>
@@ -26202,7 +26381,7 @@
           <w:sz w:val="24"/>
           <w:szCs w:val="24"/>
         </w:rPr>
-        <w:t xml:space="preserve">For Lesson 6 (Coin Combos) and Lesson 9 (Measure It!). Print, cut along the circles and strips, and keep in an envelope.</w:t>
+        <w:t xml:space="preserve">For Lesson 6 (Coin Combos) and Lesson 9 (Measure It!). Print, cut along the dashed lines, and keep in an envelope.</w:t>
       </w:r>
     </w:p>
     <w:p>
@@ -26346,13 +26525,13 @@
           <w:sz w:val="40"/>
           <w:szCs w:val="40"/>
         </w:rPr>
-        <w:t xml:space="preserve">Inquirer Kit</w:t>
-      </w:r>
-    </w:p>
-    <w:p>
-      <w:pPr>
-        <w:keepLines/>
-        <w:spacing w:after="100" w:before="0" w:line="320" w:lineRule="auto"/>
+        <w:t xml:space="preserve">Play notes and $1 coins</w:t>
+      </w:r>
+    </w:p>
+    <w:p>
+      <w:pPr>
+        <w:keepLines/>
+        <w:spacing w:after="120" w:before="0" w:line="320" w:lineRule="auto"/>
         <w:jc w:val="center"/>
       </w:pPr>
       <w:r>
@@ -26361,7 +26540,7 @@
           <w:sz w:val="24"/>
           <w:szCs w:val="24"/>
         </w:rPr>
-        <w:t xml:space="preserve">Nothing needs to be bought. Print, cut out and keep everything in one envelope.</w:t>
+        <w:t xml:space="preserve">For Lesson 6 (Coin Combos). Cut along the dashed lines.</w:t>
       </w:r>
     </w:p>
     <w:p>
@@ -26373,9 +26552,9 @@
       <w:r>
         <w:drawing>
           <wp:inline distT="0" distB="0" distL="0" distR="0">
-            <wp:extent cx="5715000" cy="4819650"/>
+            <wp:extent cx="5715000" cy="4010025"/>
             <wp:effectExtent t="0" r="0" b="0" l="0"/>
-            <wp:docPr id="11" name="kit_frames.png" descr="kit_frames.png" title="kit_frames.png"/>
+            <wp:docPr id="11" name="kit_notes.png" descr="kit_notes.png" title="kit_notes.png"/>
             <wp:cNvGraphicFramePr>
               <a:graphicFrameLocks xmlns:a="http://schemas.openxmlformats.org/drawingml/2006/main" noChangeAspect="1"/>
             </wp:cNvGraphicFramePr>
@@ -26398,7 +26577,7 @@
                   <pic:spPr bwMode="auto">
                     <a:xfrm>
                       <a:off x="0" y="0"/>
-                      <a:ext cx="5715000" cy="4819650"/>
+                      <a:ext cx="5715000" cy="4010025"/>
                     </a:xfrm>
                     <a:prstGeom prst="rect">
                       <a:avLst/>
@@ -26426,7 +26605,22 @@
           <w:sz w:val="40"/>
           <w:szCs w:val="40"/>
         </w:rPr>
-        <w:t xml:space="preserve">Number strips and sorting tiles</w:t>
+        <w:t xml:space="preserve">Inquirer Kit</w:t>
+      </w:r>
+    </w:p>
+    <w:p>
+      <w:pPr>
+        <w:keepLines/>
+        <w:spacing w:after="100" w:before="0" w:line="320" w:lineRule="auto"/>
+        <w:jc w:val="center"/>
+      </w:pPr>
+      <w:r>
+        <w:rPr>
+          <w:rFonts w:ascii="Arial" w:cs="Arial" w:eastAsia="Arial" w:hAnsi="Arial"/>
+          <w:sz w:val="24"/>
+          <w:szCs w:val="24"/>
+        </w:rPr>
+        <w:t xml:space="preserve">Nothing needs to be bought. Print, cut out and keep everything in one envelope.</w:t>
       </w:r>
     </w:p>
     <w:p>
@@ -26438,9 +26632,9 @@
       <w:r>
         <w:drawing>
           <wp:inline distT="0" distB="0" distL="0" distR="0">
-            <wp:extent cx="5715000" cy="2857500"/>
+            <wp:extent cx="5715000" cy="4819650"/>
             <wp:effectExtent t="0" r="0" b="0" l="0"/>
-            <wp:docPr id="12" name="kit_strips.png" descr="kit_strips.png" title="kit_strips.png"/>
+            <wp:docPr id="12" name="kit_frames.png" descr="kit_frames.png" title="kit_frames.png"/>
             <wp:cNvGraphicFramePr>
               <a:graphicFrameLocks xmlns:a="http://schemas.openxmlformats.org/drawingml/2006/main" noChangeAspect="1"/>
             </wp:cNvGraphicFramePr>
@@ -26463,7 +26657,7 @@
                   <pic:spPr bwMode="auto">
                     <a:xfrm>
                       <a:off x="0" y="0"/>
-                      <a:ext cx="5715000" cy="2857500"/>
+                      <a:ext cx="5715000" cy="4819650"/>
                     </a:xfrm>
                     <a:prstGeom prst="rect">
                       <a:avLst/>
@@ -26479,15 +26673,33 @@
     <w:p>
       <w:pPr>
         <w:keepLines/>
+        <w:pageBreakBefore/>
+        <w:spacing w:after="80" w:before="0" w:line="320" w:lineRule="auto"/>
+        <w:jc w:val="center"/>
+      </w:pPr>
+      <w:r>
+        <w:rPr>
+          <w:rFonts w:ascii="Arial" w:cs="Arial" w:eastAsia="Arial" w:hAnsi="Arial"/>
+          <w:b/>
+          <w:bCs/>
+          <w:sz w:val="40"/>
+          <w:szCs w:val="40"/>
+        </w:rPr>
+        <w:t xml:space="preserve">Number strips and sorting tiles</w:t>
+      </w:r>
+    </w:p>
+    <w:p>
+      <w:pPr>
+        <w:keepLines/>
         <w:spacing w:after="120" w:before="0" w:line="320" w:lineRule="auto"/>
         <w:jc w:val="center"/>
       </w:pPr>
       <w:r>
         <w:drawing>
           <wp:inline distT="0" distB="0" distL="0" distR="0">
-            <wp:extent cx="5715000" cy="3724275"/>
+            <wp:extent cx="5715000" cy="2857500"/>
             <wp:effectExtent t="0" r="0" b="0" l="0"/>
-            <wp:docPr id="13" name="kit_tiles.png" descr="kit_tiles.png" title="kit_tiles.png"/>
+            <wp:docPr id="13" name="kit_strips.png" descr="kit_strips.png" title="kit_strips.png"/>
             <wp:cNvGraphicFramePr>
               <a:graphicFrameLocks xmlns:a="http://schemas.openxmlformats.org/drawingml/2006/main" noChangeAspect="1"/>
             </wp:cNvGraphicFramePr>
@@ -26502,6 +26714,53 @@
                   </pic:nvPicPr>
                   <pic:blipFill>
                     <a:blip r:embed="rId20" cstate="none"/>
+                    <a:srcRect/>
+                    <a:stretch>
+                      <a:fillRect/>
+                    </a:stretch>
+                  </pic:blipFill>
+                  <pic:spPr bwMode="auto">
+                    <a:xfrm>
+                      <a:off x="0" y="0"/>
+                      <a:ext cx="5715000" cy="2857500"/>
+                    </a:xfrm>
+                    <a:prstGeom prst="rect">
+                      <a:avLst/>
+                    </a:prstGeom>
+                  </pic:spPr>
+                </pic:pic>
+              </a:graphicData>
+            </a:graphic>
+          </wp:inline>
+        </w:drawing>
+      </w:r>
+    </w:p>
+    <w:p>
+      <w:pPr>
+        <w:keepLines/>
+        <w:spacing w:after="120" w:before="0" w:line="320" w:lineRule="auto"/>
+        <w:jc w:val="center"/>
+      </w:pPr>
+      <w:r>
+        <w:drawing>
+          <wp:inline distT="0" distB="0" distL="0" distR="0">
+            <wp:extent cx="5715000" cy="3724275"/>
+            <wp:effectExtent t="0" r="0" b="0" l="0"/>
+            <wp:docPr id="14" name="kit_tiles.png" descr="kit_tiles.png" title="kit_tiles.png"/>
+            <wp:cNvGraphicFramePr>
+              <a:graphicFrameLocks xmlns:a="http://schemas.openxmlformats.org/drawingml/2006/main" noChangeAspect="1"/>
+            </wp:cNvGraphicFramePr>
+            <a:graphic xmlns:a="http://schemas.openxmlformats.org/drawingml/2006/main">
+              <a:graphicData uri="http://schemas.openxmlformats.org/drawingml/2006/picture">
+                <pic:pic xmlns:pic="http://schemas.openxmlformats.org/drawingml/2006/picture">
+                  <pic:nvPicPr>
+                    <pic:cNvPr id="0" name="" descr=""/>
+                    <pic:cNvPicPr>
+                      <a:picLocks noChangeAspect="1" noChangeArrowheads="1"/>
+                    </pic:cNvPicPr>
+                  </pic:nvPicPr>
+                  <pic:blipFill>
+                    <a:blip r:embed="rId21" cstate="none"/>
                     <a:srcRect/>
                     <a:stretch>
                       <a:fillRect/>

</xml_diff>

<commit_message>
WIP: story integration (Levels 1-2 done)
Co-Authored-By: Claude Sonnet 5.5 <noreply@anthropic.com>
Claude-Session: https://claude.ai/code/session_01NYgB3ju57UwWRpkPPM6X7F
</commit_message>
<xml_diff>
--- a/outputs/workbook/Math_Inquirers_P1_Student_Workbook.docx
+++ b/outputs/workbook/Math_Inquirers_P1_Student_Workbook.docx
@@ -4307,6 +4307,147 @@
     <w:p>
       <w:pPr>
         <w:keepLines/>
+        <w:spacing w:after="60" w:before="0" w:line="320" w:lineRule="auto"/>
+      </w:pPr>
+      <w:r>
+        <w:rPr>
+          <w:rFonts w:ascii="Arial" w:cs="Arial" w:eastAsia="Arial" w:hAnsi="Arial"/>
+          <w:sz w:val="26"/>
+          <w:szCs w:val="26"/>
+        </w:rPr>
+        <w:t xml:space="preserve"/>
+      </w:r>
+    </w:p>
+    <w:tbl>
+      <w:tblPr>
+        <w:tblW w:type="dxa" w:w="9900"/>
+        <w:tblBorders>
+          <w:top w:val="single" w:color="auto" w:sz="4"/>
+          <w:left w:val="single" w:color="auto" w:sz="4"/>
+          <w:bottom w:val="single" w:color="auto" w:sz="4"/>
+          <w:right w:val="single" w:color="auto" w:sz="4"/>
+          <w:insideH w:val="single" w:color="auto" w:sz="4"/>
+          <w:insideV w:val="single" w:color="auto" w:sz="4"/>
+        </w:tblBorders>
+      </w:tblPr>
+      <w:tblGrid>
+        <w:gridCol w:w="9900"/>
+      </w:tblGrid>
+      <w:tr>
+        <w:trPr>
+          <w:cantSplit/>
+        </w:trPr>
+        <w:tc>
+          <w:tcPr>
+            <w:tcW w:type="dxa" w:w="9900"/>
+            <w:tcBorders>
+              <w:top w:val="single" w:color="000000" w:sz="8"/>
+              <w:left w:val="single" w:color="000000" w:sz="8"/>
+              <w:bottom w:val="single" w:color="000000" w:sz="8"/>
+              <w:right w:val="single" w:color="000000" w:sz="8"/>
+            </w:tcBorders>
+            <w:shd w:fill="FFF6D6" w:color="auto" w:val="clear"/>
+            <w:tcMar>
+              <w:top w:type="dxa" w:w="50"/>
+              <w:left w:type="dxa" w:w="100"/>
+              <w:bottom w:type="dxa" w:w="50"/>
+              <w:right w:type="dxa" w:w="100"/>
+            </w:tcMar>
+            <w:vAlign w:val="center"/>
+          </w:tcPr>
+          <w:p>
+            <w:pPr>
+              <w:keepLines/>
+              <w:spacing w:after="30" w:before="0" w:line="320" w:lineRule="auto"/>
+            </w:pPr>
+            <w:r>
+              <w:rPr>
+                <w:rFonts w:ascii="Arial" w:cs="Arial" w:eastAsia="Arial" w:hAnsi="Arial"/>
+                <w:b/>
+                <w:bCs/>
+                <w:color w:val="1F7A6F"/>
+                <w:sz w:val="22"/>
+                <w:szCs w:val="22"/>
+              </w:rPr>
+              <w:t xml:space="preserve">Story corner: Julia Robinson  </w:t>
+            </w:r>
+            <w:r>
+              <w:rPr>
+                <w:rFonts w:ascii="Arial" w:cs="Arial" w:eastAsia="Arial" w:hAnsi="Arial"/>
+                <w:sz w:val="18"/>
+                <w:szCs w:val="18"/>
+              </w:rPr>
+              <w:t xml:space="preserve">Just for fun. You can pass.</w:t>
+            </w:r>
+          </w:p>
+          <w:p>
+            <w:pPr>
+              <w:keepLines/>
+              <w:spacing w:after="30" w:before="0" w:line="260" w:lineRule="auto"/>
+            </w:pPr>
+            <w:r>
+              <w:rPr>
+                <w:rFonts w:ascii="Arial" w:cs="Arial" w:eastAsia="Arial" w:hAnsi="Arial"/>
+                <w:sz w:val="20"/>
+                <w:szCs w:val="20"/>
+              </w:rPr>
+              <w:t xml:space="preserve">Julia Robinson (USA, 1919-1985) loved the counting numbers, and as a small child she liked arranging pebbles. She grew up to be a mathematician who worked on hard number puzzles.</w:t>
+            </w:r>
+          </w:p>
+          <w:p>
+            <w:pPr>
+              <w:keepLines/>
+              <w:spacing w:after="30" w:before="0" w:line="260" w:lineRule="auto"/>
+            </w:pPr>
+            <w:r>
+              <w:rPr>
+                <w:rFonts w:ascii="Arial" w:cs="Arial" w:eastAsia="Arial" w:hAnsi="Arial"/>
+                <w:b/>
+                <w:bCs/>
+                <w:sz w:val="20"/>
+                <w:szCs w:val="20"/>
+              </w:rPr>
+              <w:t xml:space="preserve">Try it: </w:t>
+            </w:r>
+            <w:r>
+              <w:rPr>
+                <w:rFonts w:ascii="Arial" w:cs="Arial" w:eastAsia="Arial" w:hAnsi="Arial"/>
+                <w:sz w:val="20"/>
+                <w:szCs w:val="20"/>
+              </w:rPr>
+              <w:t xml:space="preserve">Julia puts pebbles in rows. Row 1 has 3 pebbles, row 2 has 6, row 3 has 9. How many pebbles are in row 5? What is the rule?</w:t>
+            </w:r>
+          </w:p>
+          <w:p>
+            <w:pPr>
+              <w:keepLines/>
+              <w:spacing w:after="0" w:before="0" w:line="320" w:lineRule="auto"/>
+            </w:pPr>
+            <w:r>
+              <w:rPr>
+                <w:rFonts w:ascii="Arial" w:cs="Arial" w:eastAsia="Arial" w:hAnsi="Arial"/>
+                <w:b/>
+                <w:bCs/>
+                <w:sz w:val="20"/>
+                <w:szCs w:val="20"/>
+              </w:rPr>
+              <w:t xml:space="preserve">My answer: </w:t>
+            </w:r>
+            <w:r>
+              <w:rPr>
+                <w:rFonts w:ascii="Arial" w:cs="Arial" w:eastAsia="Arial" w:hAnsi="Arial"/>
+                <w:sz w:val="20"/>
+                <w:szCs w:val="20"/>
+              </w:rPr>
+              <w:t xml:space="preserve">______________________________</w:t>
+            </w:r>
+          </w:p>
+        </w:tc>
+      </w:tr>
+    </w:tbl>
+    <w:p>
+      <w:pPr>
+        <w:keepLines/>
         <w:pageBreakBefore/>
         <w:spacing w:after="60" w:before="0" w:line="320" w:lineRule="auto"/>
         <w:jc w:val="right"/>
@@ -7119,6 +7260,147 @@
     <w:p>
       <w:pPr>
         <w:keepLines/>
+        <w:spacing w:after="60" w:before="0" w:line="320" w:lineRule="auto"/>
+      </w:pPr>
+      <w:r>
+        <w:rPr>
+          <w:rFonts w:ascii="Arial" w:cs="Arial" w:eastAsia="Arial" w:hAnsi="Arial"/>
+          <w:sz w:val="26"/>
+          <w:szCs w:val="26"/>
+        </w:rPr>
+        <w:t xml:space="preserve"/>
+      </w:r>
+    </w:p>
+    <w:tbl>
+      <w:tblPr>
+        <w:tblW w:type="dxa" w:w="9900"/>
+        <w:tblBorders>
+          <w:top w:val="single" w:color="auto" w:sz="4"/>
+          <w:left w:val="single" w:color="auto" w:sz="4"/>
+          <w:bottom w:val="single" w:color="auto" w:sz="4"/>
+          <w:right w:val="single" w:color="auto" w:sz="4"/>
+          <w:insideH w:val="single" w:color="auto" w:sz="4"/>
+          <w:insideV w:val="single" w:color="auto" w:sz="4"/>
+        </w:tblBorders>
+      </w:tblPr>
+      <w:tblGrid>
+        <w:gridCol w:w="9900"/>
+      </w:tblGrid>
+      <w:tr>
+        <w:trPr>
+          <w:cantSplit/>
+        </w:trPr>
+        <w:tc>
+          <w:tcPr>
+            <w:tcW w:type="dxa" w:w="9900"/>
+            <w:tcBorders>
+              <w:top w:val="single" w:color="000000" w:sz="8"/>
+              <w:left w:val="single" w:color="000000" w:sz="8"/>
+              <w:bottom w:val="single" w:color="000000" w:sz="8"/>
+              <w:right w:val="single" w:color="000000" w:sz="8"/>
+            </w:tcBorders>
+            <w:shd w:fill="FFF6D6" w:color="auto" w:val="clear"/>
+            <w:tcMar>
+              <w:top w:type="dxa" w:w="50"/>
+              <w:left w:type="dxa" w:w="100"/>
+              <w:bottom w:type="dxa" w:w="50"/>
+              <w:right w:type="dxa" w:w="100"/>
+            </w:tcMar>
+            <w:vAlign w:val="center"/>
+          </w:tcPr>
+          <w:p>
+            <w:pPr>
+              <w:keepLines/>
+              <w:spacing w:after="30" w:before="0" w:line="320" w:lineRule="auto"/>
+            </w:pPr>
+            <w:r>
+              <w:rPr>
+                <w:rFonts w:ascii="Arial" w:cs="Arial" w:eastAsia="Arial" w:hAnsi="Arial"/>
+                <w:b/>
+                <w:bCs/>
+                <w:color w:val="1F7A6F"/>
+                <w:sz w:val="22"/>
+                <w:szCs w:val="22"/>
+              </w:rPr>
+              <w:t xml:space="preserve">Story corner: Robert Recorde  </w:t>
+            </w:r>
+            <w:r>
+              <w:rPr>
+                <w:rFonts w:ascii="Arial" w:cs="Arial" w:eastAsia="Arial" w:hAnsi="Arial"/>
+                <w:sz w:val="18"/>
+                <w:szCs w:val="18"/>
+              </w:rPr>
+              <w:t xml:space="preserve">Just for fun. You can pass.</w:t>
+            </w:r>
+          </w:p>
+          <w:p>
+            <w:pPr>
+              <w:keepLines/>
+              <w:spacing w:after="30" w:before="0" w:line="260" w:lineRule="auto"/>
+            </w:pPr>
+            <w:r>
+              <w:rPr>
+                <w:rFonts w:ascii="Arial" w:cs="Arial" w:eastAsia="Arial" w:hAnsi="Arial"/>
+                <w:sz w:val="20"/>
+                <w:szCs w:val="20"/>
+              </w:rPr>
+              <w:t xml:space="preserve">Robert Recorde (Wales, about 1510-1558) was a doctor who wrote maths books. In 1557 he used the sign = for the first time in a book, because no two things can be more equal than two straight lines of the same length.</w:t>
+            </w:r>
+          </w:p>
+          <w:p>
+            <w:pPr>
+              <w:keepLines/>
+              <w:spacing w:after="30" w:before="0" w:line="260" w:lineRule="auto"/>
+            </w:pPr>
+            <w:r>
+              <w:rPr>
+                <w:rFonts w:ascii="Arial" w:cs="Arial" w:eastAsia="Arial" w:hAnsi="Arial"/>
+                <w:b/>
+                <w:bCs/>
+                <w:sz w:val="20"/>
+                <w:szCs w:val="20"/>
+              </w:rPr>
+              <w:t xml:space="preserve">Try it: </w:t>
+            </w:r>
+            <w:r>
+              <w:rPr>
+                <w:rFonts w:ascii="Arial" w:cs="Arial" w:eastAsia="Arial" w:hAnsi="Arial"/>
+                <w:sz w:val="20"/>
+                <w:szCs w:val="20"/>
+              </w:rPr>
+              <w:t xml:space="preserve">Use Recorde's sign. Fill in the missing number so that both sides are equal: 4 + 4 = 5 + __</w:t>
+            </w:r>
+          </w:p>
+          <w:p>
+            <w:pPr>
+              <w:keepLines/>
+              <w:spacing w:after="0" w:before="0" w:line="320" w:lineRule="auto"/>
+            </w:pPr>
+            <w:r>
+              <w:rPr>
+                <w:rFonts w:ascii="Arial" w:cs="Arial" w:eastAsia="Arial" w:hAnsi="Arial"/>
+                <w:b/>
+                <w:bCs/>
+                <w:sz w:val="20"/>
+                <w:szCs w:val="20"/>
+              </w:rPr>
+              <w:t xml:space="preserve">My answer: </w:t>
+            </w:r>
+            <w:r>
+              <w:rPr>
+                <w:rFonts w:ascii="Arial" w:cs="Arial" w:eastAsia="Arial" w:hAnsi="Arial"/>
+                <w:sz w:val="20"/>
+                <w:szCs w:val="20"/>
+              </w:rPr>
+              <w:t xml:space="preserve">______________________________</w:t>
+            </w:r>
+          </w:p>
+        </w:tc>
+      </w:tr>
+    </w:tbl>
+    <w:p>
+      <w:pPr>
+        <w:keepLines/>
         <w:pageBreakBefore/>
         <w:spacing w:after="60" w:before="0" w:line="320" w:lineRule="auto"/>
         <w:jc w:val="right"/>
@@ -11121,6 +11403,147 @@
                 <w:szCs w:val="19"/>
               </w:rPr>
               <w:t xml:space="preserve"> I would like to pass    </w:t>
+            </w:r>
+          </w:p>
+        </w:tc>
+      </w:tr>
+    </w:tbl>
+    <w:p>
+      <w:pPr>
+        <w:keepLines/>
+        <w:spacing w:after="60" w:before="0" w:line="320" w:lineRule="auto"/>
+      </w:pPr>
+      <w:r>
+        <w:rPr>
+          <w:rFonts w:ascii="Arial" w:cs="Arial" w:eastAsia="Arial" w:hAnsi="Arial"/>
+          <w:sz w:val="26"/>
+          <w:szCs w:val="26"/>
+        </w:rPr>
+        <w:t xml:space="preserve"/>
+      </w:r>
+    </w:p>
+    <w:tbl>
+      <w:tblPr>
+        <w:tblW w:type="dxa" w:w="9900"/>
+        <w:tblBorders>
+          <w:top w:val="single" w:color="auto" w:sz="4"/>
+          <w:left w:val="single" w:color="auto" w:sz="4"/>
+          <w:bottom w:val="single" w:color="auto" w:sz="4"/>
+          <w:right w:val="single" w:color="auto" w:sz="4"/>
+          <w:insideH w:val="single" w:color="auto" w:sz="4"/>
+          <w:insideV w:val="single" w:color="auto" w:sz="4"/>
+        </w:tblBorders>
+      </w:tblPr>
+      <w:tblGrid>
+        <w:gridCol w:w="9900"/>
+      </w:tblGrid>
+      <w:tr>
+        <w:trPr>
+          <w:cantSplit/>
+        </w:trPr>
+        <w:tc>
+          <w:tcPr>
+            <w:tcW w:type="dxa" w:w="9900"/>
+            <w:tcBorders>
+              <w:top w:val="single" w:color="000000" w:sz="8"/>
+              <w:left w:val="single" w:color="000000" w:sz="8"/>
+              <w:bottom w:val="single" w:color="000000" w:sz="8"/>
+              <w:right w:val="single" w:color="000000" w:sz="8"/>
+            </w:tcBorders>
+            <w:shd w:fill="FFF6D6" w:color="auto" w:val="clear"/>
+            <w:tcMar>
+              <w:top w:type="dxa" w:w="50"/>
+              <w:left w:type="dxa" w:w="100"/>
+              <w:bottom w:type="dxa" w:w="50"/>
+              <w:right w:type="dxa" w:w="100"/>
+            </w:tcMar>
+            <w:vAlign w:val="center"/>
+          </w:tcPr>
+          <w:p>
+            <w:pPr>
+              <w:keepLines/>
+              <w:spacing w:after="30" w:before="0" w:line="320" w:lineRule="auto"/>
+            </w:pPr>
+            <w:r>
+              <w:rPr>
+                <w:rFonts w:ascii="Arial" w:cs="Arial" w:eastAsia="Arial" w:hAnsi="Arial"/>
+                <w:b/>
+                <w:bCs/>
+                <w:color w:val="1F7A6F"/>
+                <w:sz w:val="22"/>
+                <w:szCs w:val="22"/>
+              </w:rPr>
+              <w:t xml:space="preserve">Story corner: Marie Neurath  </w:t>
+            </w:r>
+            <w:r>
+              <w:rPr>
+                <w:rFonts w:ascii="Arial" w:cs="Arial" w:eastAsia="Arial" w:hAnsi="Arial"/>
+                <w:sz w:val="18"/>
+                <w:szCs w:val="18"/>
+              </w:rPr>
+              <w:t xml:space="preserve">Just for fun. You can pass.</w:t>
+            </w:r>
+          </w:p>
+          <w:p>
+            <w:pPr>
+              <w:keepLines/>
+              <w:spacing w:after="30" w:before="0" w:line="260" w:lineRule="auto"/>
+            </w:pPr>
+            <w:r>
+              <w:rPr>
+                <w:rFonts w:ascii="Arial" w:cs="Arial" w:eastAsia="Arial" w:hAnsi="Arial"/>
+                <w:sz w:val="20"/>
+                <w:szCs w:val="20"/>
+              </w:rPr>
+              <w:t xml:space="preserve">Marie Neurath (Germany, 1898-1986) helped make Isotype, a way of showing numbers with little pictures. More of something means more pictures, all the same size.</w:t>
+            </w:r>
+          </w:p>
+          <w:p>
+            <w:pPr>
+              <w:keepLines/>
+              <w:spacing w:after="30" w:before="0" w:line="260" w:lineRule="auto"/>
+            </w:pPr>
+            <w:r>
+              <w:rPr>
+                <w:rFonts w:ascii="Arial" w:cs="Arial" w:eastAsia="Arial" w:hAnsi="Arial"/>
+                <w:b/>
+                <w:bCs/>
+                <w:sz w:val="20"/>
+                <w:szCs w:val="20"/>
+              </w:rPr>
+              <w:t xml:space="preserve">Try it: </w:t>
+            </w:r>
+            <w:r>
+              <w:rPr>
+                <w:rFonts w:ascii="Arial" w:cs="Arial" w:eastAsia="Arial" w:hAnsi="Arial"/>
+                <w:sz w:val="20"/>
+                <w:szCs w:val="20"/>
+              </w:rPr>
+              <w:t xml:space="preserve">Marie draws one small apple picture for each child who chose apples. 6 children chose apples and 4 chose pears. How many apple pictures does she draw? How many more apple pictures than pear pictures?</w:t>
+            </w:r>
+          </w:p>
+          <w:p>
+            <w:pPr>
+              <w:keepLines/>
+              <w:spacing w:after="0" w:before="0" w:line="320" w:lineRule="auto"/>
+            </w:pPr>
+            <w:r>
+              <w:rPr>
+                <w:rFonts w:ascii="Arial" w:cs="Arial" w:eastAsia="Arial" w:hAnsi="Arial"/>
+                <w:b/>
+                <w:bCs/>
+                <w:sz w:val="20"/>
+                <w:szCs w:val="20"/>
+              </w:rPr>
+              <w:t xml:space="preserve">My answer: </w:t>
+            </w:r>
+            <w:r>
+              <w:rPr>
+                <w:rFonts w:ascii="Arial" w:cs="Arial" w:eastAsia="Arial" w:hAnsi="Arial"/>
+                <w:sz w:val="20"/>
+                <w:szCs w:val="20"/>
+              </w:rPr>
+              <w:t xml:space="preserve">______________________________</w:t>
             </w:r>
           </w:p>
         </w:tc>
@@ -14484,6 +14907,147 @@
                 <w:szCs w:val="19"/>
               </w:rPr>
               <w:t xml:space="preserve"> I would like to pass    </w:t>
+            </w:r>
+          </w:p>
+        </w:tc>
+      </w:tr>
+    </w:tbl>
+    <w:p>
+      <w:pPr>
+        <w:keepLines/>
+        <w:spacing w:after="60" w:before="0" w:line="320" w:lineRule="auto"/>
+      </w:pPr>
+      <w:r>
+        <w:rPr>
+          <w:rFonts w:ascii="Arial" w:cs="Arial" w:eastAsia="Arial" w:hAnsi="Arial"/>
+          <w:sz w:val="26"/>
+          <w:szCs w:val="26"/>
+        </w:rPr>
+        <w:t xml:space="preserve"/>
+      </w:r>
+    </w:p>
+    <w:tbl>
+      <w:tblPr>
+        <w:tblW w:type="dxa" w:w="9900"/>
+        <w:tblBorders>
+          <w:top w:val="single" w:color="auto" w:sz="4"/>
+          <w:left w:val="single" w:color="auto" w:sz="4"/>
+          <w:bottom w:val="single" w:color="auto" w:sz="4"/>
+          <w:right w:val="single" w:color="auto" w:sz="4"/>
+          <w:insideH w:val="single" w:color="auto" w:sz="4"/>
+          <w:insideV w:val="single" w:color="auto" w:sz="4"/>
+        </w:tblBorders>
+      </w:tblPr>
+      <w:tblGrid>
+        <w:gridCol w:w="9900"/>
+      </w:tblGrid>
+      <w:tr>
+        <w:trPr>
+          <w:cantSplit/>
+        </w:trPr>
+        <w:tc>
+          <w:tcPr>
+            <w:tcW w:type="dxa" w:w="9900"/>
+            <w:tcBorders>
+              <w:top w:val="single" w:color="000000" w:sz="8"/>
+              <w:left w:val="single" w:color="000000" w:sz="8"/>
+              <w:bottom w:val="single" w:color="000000" w:sz="8"/>
+              <w:right w:val="single" w:color="000000" w:sz="8"/>
+            </w:tcBorders>
+            <w:shd w:fill="FFF6D6" w:color="auto" w:val="clear"/>
+            <w:tcMar>
+              <w:top w:type="dxa" w:w="50"/>
+              <w:left w:type="dxa" w:w="100"/>
+              <w:bottom w:type="dxa" w:w="50"/>
+              <w:right w:type="dxa" w:w="100"/>
+            </w:tcMar>
+            <w:vAlign w:val="center"/>
+          </w:tcPr>
+          <w:p>
+            <w:pPr>
+              <w:keepLines/>
+              <w:spacing w:after="30" w:before="0" w:line="320" w:lineRule="auto"/>
+            </w:pPr>
+            <w:r>
+              <w:rPr>
+                <w:rFonts w:ascii="Arial" w:cs="Arial" w:eastAsia="Arial" w:hAnsi="Arial"/>
+                <w:b/>
+                <w:bCs/>
+                <w:color w:val="1F7A6F"/>
+                <w:sz w:val="22"/>
+                <w:szCs w:val="22"/>
+              </w:rPr>
+              <w:t xml:space="preserve">Story corner: Ingrid Daubechies  </w:t>
+            </w:r>
+            <w:r>
+              <w:rPr>
+                <w:rFonts w:ascii="Arial" w:cs="Arial" w:eastAsia="Arial" w:hAnsi="Arial"/>
+                <w:sz w:val="18"/>
+                <w:szCs w:val="18"/>
+              </w:rPr>
+              <w:t xml:space="preserve">Just for fun. You can pass.</w:t>
+            </w:r>
+          </w:p>
+          <w:p>
+            <w:pPr>
+              <w:keepLines/>
+              <w:spacing w:after="30" w:before="0" w:line="260" w:lineRule="auto"/>
+            </w:pPr>
+            <w:r>
+              <w:rPr>
+                <w:rFonts w:ascii="Arial" w:cs="Arial" w:eastAsia="Arial" w:hAnsi="Arial"/>
+                <w:sz w:val="20"/>
+                <w:szCs w:val="20"/>
+              </w:rPr>
+              <w:t xml:space="preserve">Ingrid Daubechies (Belgium, born 1954) liked weaving as a girl. When she could not sleep she doubled numbers in her head: 2, 4, 8, 16 and on. Now she is a maths professor.</w:t>
+            </w:r>
+          </w:p>
+          <w:p>
+            <w:pPr>
+              <w:keepLines/>
+              <w:spacing w:after="30" w:before="0" w:line="260" w:lineRule="auto"/>
+            </w:pPr>
+            <w:r>
+              <w:rPr>
+                <w:rFonts w:ascii="Arial" w:cs="Arial" w:eastAsia="Arial" w:hAnsi="Arial"/>
+                <w:b/>
+                <w:bCs/>
+                <w:sz w:val="20"/>
+                <w:szCs w:val="20"/>
+              </w:rPr>
+              <w:t xml:space="preserve">Try it: </w:t>
+            </w:r>
+            <w:r>
+              <w:rPr>
+                <w:rFonts w:ascii="Arial" w:cs="Arial" w:eastAsia="Arial" w:hAnsi="Arial"/>
+                <w:sz w:val="20"/>
+                <w:szCs w:val="20"/>
+              </w:rPr>
+              <w:t xml:space="preserve">Try Ingrid's doubling game: 1, 2, 4, 8, __, __. What is the rule? What are the next two numbers?</w:t>
+            </w:r>
+          </w:p>
+          <w:p>
+            <w:pPr>
+              <w:keepLines/>
+              <w:spacing w:after="0" w:before="0" w:line="320" w:lineRule="auto"/>
+            </w:pPr>
+            <w:r>
+              <w:rPr>
+                <w:rFonts w:ascii="Arial" w:cs="Arial" w:eastAsia="Arial" w:hAnsi="Arial"/>
+                <w:b/>
+                <w:bCs/>
+                <w:sz w:val="20"/>
+                <w:szCs w:val="20"/>
+              </w:rPr>
+              <w:t xml:space="preserve">My answer: </w:t>
+            </w:r>
+            <w:r>
+              <w:rPr>
+                <w:rFonts w:ascii="Arial" w:cs="Arial" w:eastAsia="Arial" w:hAnsi="Arial"/>
+                <w:sz w:val="20"/>
+                <w:szCs w:val="20"/>
+              </w:rPr>
+              <w:t xml:space="preserve">______________________________</w:t>
             </w:r>
           </w:p>
         </w:tc>
@@ -20060,6 +20624,147 @@
     <w:p>
       <w:pPr>
         <w:keepLines/>
+        <w:spacing w:after="60" w:before="0" w:line="320" w:lineRule="auto"/>
+      </w:pPr>
+      <w:r>
+        <w:rPr>
+          <w:rFonts w:ascii="Arial" w:cs="Arial" w:eastAsia="Arial" w:hAnsi="Arial"/>
+          <w:sz w:val="26"/>
+          <w:szCs w:val="26"/>
+        </w:rPr>
+        <w:t xml:space="preserve"/>
+      </w:r>
+    </w:p>
+    <w:tbl>
+      <w:tblPr>
+        <w:tblW w:type="dxa" w:w="9900"/>
+        <w:tblBorders>
+          <w:top w:val="single" w:color="auto" w:sz="4"/>
+          <w:left w:val="single" w:color="auto" w:sz="4"/>
+          <w:bottom w:val="single" w:color="auto" w:sz="4"/>
+          <w:right w:val="single" w:color="auto" w:sz="4"/>
+          <w:insideH w:val="single" w:color="auto" w:sz="4"/>
+          <w:insideV w:val="single" w:color="auto" w:sz="4"/>
+        </w:tblBorders>
+      </w:tblPr>
+      <w:tblGrid>
+        <w:gridCol w:w="9900"/>
+      </w:tblGrid>
+      <w:tr>
+        <w:trPr>
+          <w:cantSplit/>
+        </w:trPr>
+        <w:tc>
+          <w:tcPr>
+            <w:tcW w:type="dxa" w:w="9900"/>
+            <w:tcBorders>
+              <w:top w:val="single" w:color="000000" w:sz="8"/>
+              <w:left w:val="single" w:color="000000" w:sz="8"/>
+              <w:bottom w:val="single" w:color="000000" w:sz="8"/>
+              <w:right w:val="single" w:color="000000" w:sz="8"/>
+            </w:tcBorders>
+            <w:shd w:fill="FFF6D6" w:color="auto" w:val="clear"/>
+            <w:tcMar>
+              <w:top w:type="dxa" w:w="50"/>
+              <w:left w:type="dxa" w:w="100"/>
+              <w:bottom w:type="dxa" w:w="50"/>
+              <w:right w:type="dxa" w:w="100"/>
+            </w:tcMar>
+            <w:vAlign w:val="center"/>
+          </w:tcPr>
+          <w:p>
+            <w:pPr>
+              <w:keepLines/>
+              <w:spacing w:after="30" w:before="0" w:line="320" w:lineRule="auto"/>
+            </w:pPr>
+            <w:r>
+              <w:rPr>
+                <w:rFonts w:ascii="Arial" w:cs="Arial" w:eastAsia="Arial" w:hAnsi="Arial"/>
+                <w:b/>
+                <w:bCs/>
+                <w:color w:val="1F7A6F"/>
+                <w:sz w:val="22"/>
+                <w:szCs w:val="22"/>
+              </w:rPr>
+              <w:t xml:space="preserve">Story corner: René Descartes  </w:t>
+            </w:r>
+            <w:r>
+              <w:rPr>
+                <w:rFonts w:ascii="Arial" w:cs="Arial" w:eastAsia="Arial" w:hAnsi="Arial"/>
+                <w:sz w:val="18"/>
+                <w:szCs w:val="18"/>
+              </w:rPr>
+              <w:t xml:space="preserve">Just for fun. You can pass.</w:t>
+            </w:r>
+          </w:p>
+          <w:p>
+            <w:pPr>
+              <w:keepLines/>
+              <w:spacing w:after="30" w:before="0" w:line="260" w:lineRule="auto"/>
+            </w:pPr>
+            <w:r>
+              <w:rPr>
+                <w:rFonts w:ascii="Arial" w:cs="Arial" w:eastAsia="Arial" w:hAnsi="Arial"/>
+                <w:sz w:val="20"/>
+                <w:szCs w:val="20"/>
+              </w:rPr>
+              <w:t xml:space="preserve">René Descartes (France, 1596-1650) wrote a book in 1637 that used x, y and z for numbers we do not know yet. We still call a mystery number x.</w:t>
+            </w:r>
+          </w:p>
+          <w:p>
+            <w:pPr>
+              <w:keepLines/>
+              <w:spacing w:after="30" w:before="0" w:line="260" w:lineRule="auto"/>
+            </w:pPr>
+            <w:r>
+              <w:rPr>
+                <w:rFonts w:ascii="Arial" w:cs="Arial" w:eastAsia="Arial" w:hAnsi="Arial"/>
+                <w:b/>
+                <w:bCs/>
+                <w:sz w:val="20"/>
+                <w:szCs w:val="20"/>
+              </w:rPr>
+              <w:t xml:space="preserve">Try it: </w:t>
+            </w:r>
+            <w:r>
+              <w:rPr>
+                <w:rFonts w:ascii="Arial" w:cs="Arial" w:eastAsia="Arial" w:hAnsi="Arial"/>
+                <w:sz w:val="20"/>
+                <w:szCs w:val="20"/>
+              </w:rPr>
+              <w:t xml:space="preserve">Call the mystery number x. x + 8 = 14. Work backwards: what is x?</w:t>
+            </w:r>
+          </w:p>
+          <w:p>
+            <w:pPr>
+              <w:keepLines/>
+              <w:spacing w:after="0" w:before="0" w:line="320" w:lineRule="auto"/>
+            </w:pPr>
+            <w:r>
+              <w:rPr>
+                <w:rFonts w:ascii="Arial" w:cs="Arial" w:eastAsia="Arial" w:hAnsi="Arial"/>
+                <w:b/>
+                <w:bCs/>
+                <w:sz w:val="20"/>
+                <w:szCs w:val="20"/>
+              </w:rPr>
+              <w:t xml:space="preserve">My answer: </w:t>
+            </w:r>
+            <w:r>
+              <w:rPr>
+                <w:rFonts w:ascii="Arial" w:cs="Arial" w:eastAsia="Arial" w:hAnsi="Arial"/>
+                <w:sz w:val="20"/>
+                <w:szCs w:val="20"/>
+              </w:rPr>
+              <w:t xml:space="preserve">______________________________</w:t>
+            </w:r>
+          </w:p>
+        </w:tc>
+      </w:tr>
+    </w:tbl>
+    <w:p>
+      <w:pPr>
+        <w:keepLines/>
         <w:pageBreakBefore/>
         <w:spacing w:after="60" w:before="0" w:line="320" w:lineRule="auto"/>
         <w:jc w:val="right"/>
@@ -23379,6 +24084,147 @@
     <w:p>
       <w:pPr>
         <w:keepLines/>
+        <w:spacing w:after="60" w:before="0" w:line="320" w:lineRule="auto"/>
+      </w:pPr>
+      <w:r>
+        <w:rPr>
+          <w:rFonts w:ascii="Arial" w:cs="Arial" w:eastAsia="Arial" w:hAnsi="Arial"/>
+          <w:sz w:val="26"/>
+          <w:szCs w:val="26"/>
+        </w:rPr>
+        <w:t xml:space="preserve"/>
+      </w:r>
+    </w:p>
+    <w:tbl>
+      <w:tblPr>
+        <w:tblW w:type="dxa" w:w="9900"/>
+        <w:tblBorders>
+          <w:top w:val="single" w:color="auto" w:sz="4"/>
+          <w:left w:val="single" w:color="auto" w:sz="4"/>
+          <w:bottom w:val="single" w:color="auto" w:sz="4"/>
+          <w:right w:val="single" w:color="auto" w:sz="4"/>
+          <w:insideH w:val="single" w:color="auto" w:sz="4"/>
+          <w:insideV w:val="single" w:color="auto" w:sz="4"/>
+        </w:tblBorders>
+      </w:tblPr>
+      <w:tblGrid>
+        <w:gridCol w:w="9900"/>
+      </w:tblGrid>
+      <w:tr>
+        <w:trPr>
+          <w:cantSplit/>
+        </w:trPr>
+        <w:tc>
+          <w:tcPr>
+            <w:tcW w:type="dxa" w:w="9900"/>
+            <w:tcBorders>
+              <w:top w:val="single" w:color="000000" w:sz="8"/>
+              <w:left w:val="single" w:color="000000" w:sz="8"/>
+              <w:bottom w:val="single" w:color="000000" w:sz="8"/>
+              <w:right w:val="single" w:color="000000" w:sz="8"/>
+            </w:tcBorders>
+            <w:shd w:fill="FFF6D6" w:color="auto" w:val="clear"/>
+            <w:tcMar>
+              <w:top w:type="dxa" w:w="50"/>
+              <w:left w:type="dxa" w:w="100"/>
+              <w:bottom w:type="dxa" w:w="50"/>
+              <w:right w:type="dxa" w:w="100"/>
+            </w:tcMar>
+            <w:vAlign w:val="center"/>
+          </w:tcPr>
+          <w:p>
+            <w:pPr>
+              <w:keepLines/>
+              <w:spacing w:after="30" w:before="0" w:line="320" w:lineRule="auto"/>
+            </w:pPr>
+            <w:r>
+              <w:rPr>
+                <w:rFonts w:ascii="Arial" w:cs="Arial" w:eastAsia="Arial" w:hAnsi="Arial"/>
+                <w:b/>
+                <w:bCs/>
+                <w:color w:val="1F7A6F"/>
+                <w:sz w:val="22"/>
+                <w:szCs w:val="22"/>
+              </w:rPr>
+              <w:t xml:space="preserve">Story corner: Isaac Newton  </w:t>
+            </w:r>
+            <w:r>
+              <w:rPr>
+                <w:rFonts w:ascii="Arial" w:cs="Arial" w:eastAsia="Arial" w:hAnsi="Arial"/>
+                <w:sz w:val="18"/>
+                <w:szCs w:val="18"/>
+              </w:rPr>
+              <w:t xml:space="preserve">Just for fun. You can pass.</w:t>
+            </w:r>
+          </w:p>
+          <w:p>
+            <w:pPr>
+              <w:keepLines/>
+              <w:spacing w:after="30" w:before="0" w:line="260" w:lineRule="auto"/>
+            </w:pPr>
+            <w:r>
+              <w:rPr>
+                <w:rFonts w:ascii="Arial" w:cs="Arial" w:eastAsia="Arial" w:hAnsi="Arial"/>
+                <w:sz w:val="20"/>
+                <w:szCs w:val="20"/>
+              </w:rPr>
+              <w:t xml:space="preserve">Isaac Newton (England, 1642-1727) is famous for science, but he also worked at the Royal Mint, where English coins were made. The Mint cared that every coin had the right weight.</w:t>
+            </w:r>
+          </w:p>
+          <w:p>
+            <w:pPr>
+              <w:keepLines/>
+              <w:spacing w:after="30" w:before="0" w:line="260" w:lineRule="auto"/>
+            </w:pPr>
+            <w:r>
+              <w:rPr>
+                <w:rFonts w:ascii="Arial" w:cs="Arial" w:eastAsia="Arial" w:hAnsi="Arial"/>
+                <w:b/>
+                <w:bCs/>
+                <w:sz w:val="20"/>
+                <w:szCs w:val="20"/>
+              </w:rPr>
+              <w:t xml:space="preserve">Try it: </w:t>
+            </w:r>
+            <w:r>
+              <w:rPr>
+                <w:rFonts w:ascii="Arial" w:cs="Arial" w:eastAsia="Arial" w:hAnsi="Arial"/>
+                <w:sz w:val="20"/>
+                <w:szCs w:val="20"/>
+              </w:rPr>
+              <w:t xml:space="preserve">You have one 10-cent coin and some 5-cent coins. You want 20 cents. How many 5-cent coins do you need?</w:t>
+            </w:r>
+          </w:p>
+          <w:p>
+            <w:pPr>
+              <w:keepLines/>
+              <w:spacing w:after="0" w:before="0" w:line="320" w:lineRule="auto"/>
+            </w:pPr>
+            <w:r>
+              <w:rPr>
+                <w:rFonts w:ascii="Arial" w:cs="Arial" w:eastAsia="Arial" w:hAnsi="Arial"/>
+                <w:b/>
+                <w:bCs/>
+                <w:sz w:val="20"/>
+                <w:szCs w:val="20"/>
+              </w:rPr>
+              <w:t xml:space="preserve">My answer: </w:t>
+            </w:r>
+            <w:r>
+              <w:rPr>
+                <w:rFonts w:ascii="Arial" w:cs="Arial" w:eastAsia="Arial" w:hAnsi="Arial"/>
+                <w:sz w:val="20"/>
+                <w:szCs w:val="20"/>
+              </w:rPr>
+              <w:t xml:space="preserve">______________________________</w:t>
+            </w:r>
+          </w:p>
+        </w:tc>
+      </w:tr>
+    </w:tbl>
+    <w:p>
+      <w:pPr>
+        <w:keepLines/>
         <w:pageBreakBefore/>
         <w:spacing w:after="60" w:before="0" w:line="320" w:lineRule="auto"/>
         <w:jc w:val="right"/>
@@ -27157,6 +28003,147 @@
     <w:p>
       <w:pPr>
         <w:keepLines/>
+        <w:spacing w:after="60" w:before="0" w:line="320" w:lineRule="auto"/>
+      </w:pPr>
+      <w:r>
+        <w:rPr>
+          <w:rFonts w:ascii="Arial" w:cs="Arial" w:eastAsia="Arial" w:hAnsi="Arial"/>
+          <w:sz w:val="26"/>
+          <w:szCs w:val="26"/>
+        </w:rPr>
+        <w:t xml:space="preserve"/>
+      </w:r>
+    </w:p>
+    <w:tbl>
+      <w:tblPr>
+        <w:tblW w:type="dxa" w:w="9900"/>
+        <w:tblBorders>
+          <w:top w:val="single" w:color="auto" w:sz="4"/>
+          <w:left w:val="single" w:color="auto" w:sz="4"/>
+          <w:bottom w:val="single" w:color="auto" w:sz="4"/>
+          <w:right w:val="single" w:color="auto" w:sz="4"/>
+          <w:insideH w:val="single" w:color="auto" w:sz="4"/>
+          <w:insideV w:val="single" w:color="auto" w:sz="4"/>
+        </w:tblBorders>
+      </w:tblPr>
+      <w:tblGrid>
+        <w:gridCol w:w="9900"/>
+      </w:tblGrid>
+      <w:tr>
+        <w:trPr>
+          <w:cantSplit/>
+        </w:trPr>
+        <w:tc>
+          <w:tcPr>
+            <w:tcW w:type="dxa" w:w="9900"/>
+            <w:tcBorders>
+              <w:top w:val="single" w:color="000000" w:sz="8"/>
+              <w:left w:val="single" w:color="000000" w:sz="8"/>
+              <w:bottom w:val="single" w:color="000000" w:sz="8"/>
+              <w:right w:val="single" w:color="000000" w:sz="8"/>
+            </w:tcBorders>
+            <w:shd w:fill="FFF6D6" w:color="auto" w:val="clear"/>
+            <w:tcMar>
+              <w:top w:type="dxa" w:w="50"/>
+              <w:left w:type="dxa" w:w="100"/>
+              <w:bottom w:type="dxa" w:w="50"/>
+              <w:right w:type="dxa" w:w="100"/>
+            </w:tcMar>
+            <w:vAlign w:val="center"/>
+          </w:tcPr>
+          <w:p>
+            <w:pPr>
+              <w:keepLines/>
+              <w:spacing w:after="30" w:before="0" w:line="320" w:lineRule="auto"/>
+            </w:pPr>
+            <w:r>
+              <w:rPr>
+                <w:rFonts w:ascii="Arial" w:cs="Arial" w:eastAsia="Arial" w:hAnsi="Arial"/>
+                <w:b/>
+                <w:bCs/>
+                <w:color w:val="1F7A6F"/>
+                <w:sz w:val="22"/>
+                <w:szCs w:val="22"/>
+              </w:rPr>
+              <w:t xml:space="preserve">Story corner: Johannes Kepler  </w:t>
+            </w:r>
+            <w:r>
+              <w:rPr>
+                <w:rFonts w:ascii="Arial" w:cs="Arial" w:eastAsia="Arial" w:hAnsi="Arial"/>
+                <w:sz w:val="18"/>
+                <w:szCs w:val="18"/>
+              </w:rPr>
+              <w:t xml:space="preserve">Just for fun. You can pass.</w:t>
+            </w:r>
+          </w:p>
+          <w:p>
+            <w:pPr>
+              <w:keepLines/>
+              <w:spacing w:after="30" w:before="0" w:line="260" w:lineRule="auto"/>
+            </w:pPr>
+            <w:r>
+              <w:rPr>
+                <w:rFonts w:ascii="Arial" w:cs="Arial" w:eastAsia="Arial" w:hAnsi="Arial"/>
+                <w:sz w:val="20"/>
+                <w:szCs w:val="20"/>
+              </w:rPr>
+              <w:t xml:space="preserve">Johannes Kepler (Germany, 1571-1630) was an astronomer. In 1611 he noticed that snowflakes have six corners and asked why.</w:t>
+            </w:r>
+          </w:p>
+          <w:p>
+            <w:pPr>
+              <w:keepLines/>
+              <w:spacing w:after="30" w:before="0" w:line="260" w:lineRule="auto"/>
+            </w:pPr>
+            <w:r>
+              <w:rPr>
+                <w:rFonts w:ascii="Arial" w:cs="Arial" w:eastAsia="Arial" w:hAnsi="Arial"/>
+                <w:b/>
+                <w:bCs/>
+                <w:sz w:val="20"/>
+                <w:szCs w:val="20"/>
+              </w:rPr>
+              <w:t xml:space="preserve">Try it: </w:t>
+            </w:r>
+            <w:r>
+              <w:rPr>
+                <w:rFonts w:ascii="Arial" w:cs="Arial" w:eastAsia="Arial" w:hAnsi="Arial"/>
+                <w:sz w:val="20"/>
+                <w:szCs w:val="20"/>
+              </w:rPr>
+              <w:t xml:space="preserve">Kepler's snowflake has six corners. What shape has 6 straight sides and 6 corners? How many sides do two of these shapes have altogether?</w:t>
+            </w:r>
+          </w:p>
+          <w:p>
+            <w:pPr>
+              <w:keepLines/>
+              <w:spacing w:after="0" w:before="0" w:line="320" w:lineRule="auto"/>
+            </w:pPr>
+            <w:r>
+              <w:rPr>
+                <w:rFonts w:ascii="Arial" w:cs="Arial" w:eastAsia="Arial" w:hAnsi="Arial"/>
+                <w:b/>
+                <w:bCs/>
+                <w:sz w:val="20"/>
+                <w:szCs w:val="20"/>
+              </w:rPr>
+              <w:t xml:space="preserve">My answer: </w:t>
+            </w:r>
+            <w:r>
+              <w:rPr>
+                <w:rFonts w:ascii="Arial" w:cs="Arial" w:eastAsia="Arial" w:hAnsi="Arial"/>
+                <w:sz w:val="20"/>
+                <w:szCs w:val="20"/>
+              </w:rPr>
+              <w:t xml:space="preserve">______________________________</w:t>
+            </w:r>
+          </w:p>
+        </w:tc>
+      </w:tr>
+    </w:tbl>
+    <w:p>
+      <w:pPr>
+        <w:keepLines/>
         <w:pageBreakBefore/>
         <w:spacing w:after="60" w:before="0" w:line="320" w:lineRule="auto"/>
         <w:jc w:val="right"/>
@@ -30726,6 +31713,147 @@
     <w:p>
       <w:pPr>
         <w:keepLines/>
+        <w:spacing w:after="60" w:before="0" w:line="320" w:lineRule="auto"/>
+      </w:pPr>
+      <w:r>
+        <w:rPr>
+          <w:rFonts w:ascii="Arial" w:cs="Arial" w:eastAsia="Arial" w:hAnsi="Arial"/>
+          <w:sz w:val="26"/>
+          <w:szCs w:val="26"/>
+        </w:rPr>
+        <w:t xml:space="preserve"/>
+      </w:r>
+    </w:p>
+    <w:tbl>
+      <w:tblPr>
+        <w:tblW w:type="dxa" w:w="9900"/>
+        <w:tblBorders>
+          <w:top w:val="single" w:color="auto" w:sz="4"/>
+          <w:left w:val="single" w:color="auto" w:sz="4"/>
+          <w:bottom w:val="single" w:color="auto" w:sz="4"/>
+          <w:right w:val="single" w:color="auto" w:sz="4"/>
+          <w:insideH w:val="single" w:color="auto" w:sz="4"/>
+          <w:insideV w:val="single" w:color="auto" w:sz="4"/>
+        </w:tblBorders>
+      </w:tblPr>
+      <w:tblGrid>
+        <w:gridCol w:w="9900"/>
+      </w:tblGrid>
+      <w:tr>
+        <w:trPr>
+          <w:cantSplit/>
+        </w:trPr>
+        <w:tc>
+          <w:tcPr>
+            <w:tcW w:type="dxa" w:w="9900"/>
+            <w:tcBorders>
+              <w:top w:val="single" w:color="000000" w:sz="8"/>
+              <w:left w:val="single" w:color="000000" w:sz="8"/>
+              <w:bottom w:val="single" w:color="000000" w:sz="8"/>
+              <w:right w:val="single" w:color="000000" w:sz="8"/>
+            </w:tcBorders>
+            <w:shd w:fill="FFF6D6" w:color="auto" w:val="clear"/>
+            <w:tcMar>
+              <w:top w:type="dxa" w:w="50"/>
+              <w:left w:type="dxa" w:w="100"/>
+              <w:bottom w:type="dxa" w:w="50"/>
+              <w:right w:type="dxa" w:w="100"/>
+            </w:tcMar>
+            <w:vAlign w:val="center"/>
+          </w:tcPr>
+          <w:p>
+            <w:pPr>
+              <w:keepLines/>
+              <w:spacing w:after="30" w:before="0" w:line="320" w:lineRule="auto"/>
+            </w:pPr>
+            <w:r>
+              <w:rPr>
+                <w:rFonts w:ascii="Arial" w:cs="Arial" w:eastAsia="Arial" w:hAnsi="Arial"/>
+                <w:b/>
+                <w:bCs/>
+                <w:color w:val="1F7A6F"/>
+                <w:sz w:val="22"/>
+                <w:szCs w:val="22"/>
+              </w:rPr>
+              <w:t xml:space="preserve">Story corner: Leonhard Euler  </w:t>
+            </w:r>
+            <w:r>
+              <w:rPr>
+                <w:rFonts w:ascii="Arial" w:cs="Arial" w:eastAsia="Arial" w:hAnsi="Arial"/>
+                <w:sz w:val="18"/>
+                <w:szCs w:val="18"/>
+              </w:rPr>
+              <w:t xml:space="preserve">Just for fun. You can pass.</w:t>
+            </w:r>
+          </w:p>
+          <w:p>
+            <w:pPr>
+              <w:keepLines/>
+              <w:spacing w:after="30" w:before="0" w:line="260" w:lineRule="auto"/>
+            </w:pPr>
+            <w:r>
+              <w:rPr>
+                <w:rFonts w:ascii="Arial" w:cs="Arial" w:eastAsia="Arial" w:hAnsi="Arial"/>
+                <w:sz w:val="20"/>
+                <w:szCs w:val="20"/>
+              </w:rPr>
+              <w:t xml:space="preserve">Leonhard Euler (Switzerland, 1707-1783) drew circles in his letters to show groups. A small circle inside a big circle is a smaller group inside a bigger one.</w:t>
+            </w:r>
+          </w:p>
+          <w:p>
+            <w:pPr>
+              <w:keepLines/>
+              <w:spacing w:after="30" w:before="0" w:line="260" w:lineRule="auto"/>
+            </w:pPr>
+            <w:r>
+              <w:rPr>
+                <w:rFonts w:ascii="Arial" w:cs="Arial" w:eastAsia="Arial" w:hAnsi="Arial"/>
+                <w:b/>
+                <w:bCs/>
+                <w:sz w:val="20"/>
+                <w:szCs w:val="20"/>
+              </w:rPr>
+              <w:t xml:space="preserve">Try it: </w:t>
+            </w:r>
+            <w:r>
+              <w:rPr>
+                <w:rFonts w:ascii="Arial" w:cs="Arial" w:eastAsia="Arial" w:hAnsi="Arial"/>
+                <w:sz w:val="20"/>
+                <w:szCs w:val="20"/>
+              </w:rPr>
+              <w:t xml:space="preserve">Draw a big circle for animals and a small circle inside it for cats. Is every cat an animal? Is every animal a cat?</w:t>
+            </w:r>
+          </w:p>
+          <w:p>
+            <w:pPr>
+              <w:keepLines/>
+              <w:spacing w:after="0" w:before="0" w:line="320" w:lineRule="auto"/>
+            </w:pPr>
+            <w:r>
+              <w:rPr>
+                <w:rFonts w:ascii="Arial" w:cs="Arial" w:eastAsia="Arial" w:hAnsi="Arial"/>
+                <w:b/>
+                <w:bCs/>
+                <w:sz w:val="20"/>
+                <w:szCs w:val="20"/>
+              </w:rPr>
+              <w:t xml:space="preserve">My answer: </w:t>
+            </w:r>
+            <w:r>
+              <w:rPr>
+                <w:rFonts w:ascii="Arial" w:cs="Arial" w:eastAsia="Arial" w:hAnsi="Arial"/>
+                <w:sz w:val="20"/>
+                <w:szCs w:val="20"/>
+              </w:rPr>
+              <w:t xml:space="preserve">______________________________</w:t>
+            </w:r>
+          </w:p>
+        </w:tc>
+      </w:tr>
+    </w:tbl>
+    <w:p>
+      <w:pPr>
+        <w:keepLines/>
         <w:pageBreakBefore/>
         <w:spacing w:after="60" w:before="0" w:line="320" w:lineRule="auto"/>
         <w:jc w:val="right"/>
@@ -34159,6 +35287,147 @@
     <w:p>
       <w:pPr>
         <w:keepLines/>
+        <w:spacing w:after="60" w:before="0" w:line="320" w:lineRule="auto"/>
+      </w:pPr>
+      <w:r>
+        <w:rPr>
+          <w:rFonts w:ascii="Arial" w:cs="Arial" w:eastAsia="Arial" w:hAnsi="Arial"/>
+          <w:sz w:val="26"/>
+          <w:szCs w:val="26"/>
+        </w:rPr>
+        <w:t xml:space="preserve"/>
+      </w:r>
+    </w:p>
+    <w:tbl>
+      <w:tblPr>
+        <w:tblW w:type="dxa" w:w="9900"/>
+        <w:tblBorders>
+          <w:top w:val="single" w:color="auto" w:sz="4"/>
+          <w:left w:val="single" w:color="auto" w:sz="4"/>
+          <w:bottom w:val="single" w:color="auto" w:sz="4"/>
+          <w:right w:val="single" w:color="auto" w:sz="4"/>
+          <w:insideH w:val="single" w:color="auto" w:sz="4"/>
+          <w:insideV w:val="single" w:color="auto" w:sz="4"/>
+        </w:tblBorders>
+      </w:tblPr>
+      <w:tblGrid>
+        <w:gridCol w:w="9900"/>
+      </w:tblGrid>
+      <w:tr>
+        <w:trPr>
+          <w:cantSplit/>
+        </w:trPr>
+        <w:tc>
+          <w:tcPr>
+            <w:tcW w:type="dxa" w:w="9900"/>
+            <w:tcBorders>
+              <w:top w:val="single" w:color="000000" w:sz="8"/>
+              <w:left w:val="single" w:color="000000" w:sz="8"/>
+              <w:bottom w:val="single" w:color="000000" w:sz="8"/>
+              <w:right w:val="single" w:color="000000" w:sz="8"/>
+            </w:tcBorders>
+            <w:shd w:fill="FFF6D6" w:color="auto" w:val="clear"/>
+            <w:tcMar>
+              <w:top w:type="dxa" w:w="50"/>
+              <w:left w:type="dxa" w:w="100"/>
+              <w:bottom w:type="dxa" w:w="50"/>
+              <w:right w:type="dxa" w:w="100"/>
+            </w:tcMar>
+            <w:vAlign w:val="center"/>
+          </w:tcPr>
+          <w:p>
+            <w:pPr>
+              <w:keepLines/>
+              <w:spacing w:after="30" w:before="0" w:line="320" w:lineRule="auto"/>
+            </w:pPr>
+            <w:r>
+              <w:rPr>
+                <w:rFonts w:ascii="Arial" w:cs="Arial" w:eastAsia="Arial" w:hAnsi="Arial"/>
+                <w:b/>
+                <w:bCs/>
+                <w:color w:val="1F7A6F"/>
+                <w:sz w:val="22"/>
+                <w:szCs w:val="22"/>
+              </w:rPr>
+              <w:t xml:space="preserve">Story corner: Al-Biruni  </w:t>
+            </w:r>
+            <w:r>
+              <w:rPr>
+                <w:rFonts w:ascii="Arial" w:cs="Arial" w:eastAsia="Arial" w:hAnsi="Arial"/>
+                <w:sz w:val="18"/>
+                <w:szCs w:val="18"/>
+              </w:rPr>
+              <w:t xml:space="preserve">Just for fun. You can pass.</w:t>
+            </w:r>
+          </w:p>
+          <w:p>
+            <w:pPr>
+              <w:keepLines/>
+              <w:spacing w:after="30" w:before="0" w:line="260" w:lineRule="auto"/>
+            </w:pPr>
+            <w:r>
+              <w:rPr>
+                <w:rFonts w:ascii="Arial" w:cs="Arial" w:eastAsia="Arial" w:hAnsi="Arial"/>
+                <w:sz w:val="20"/>
+                <w:szCs w:val="20"/>
+              </w:rPr>
+              <w:t xml:space="preserve">Al-Biruni (Central Asia, 973-1048) loved to measure. He used careful measuring of a hill to work out the size of the whole Earth, and found a value close to today's.</w:t>
+            </w:r>
+          </w:p>
+          <w:p>
+            <w:pPr>
+              <w:keepLines/>
+              <w:spacing w:after="30" w:before="0" w:line="260" w:lineRule="auto"/>
+            </w:pPr>
+            <w:r>
+              <w:rPr>
+                <w:rFonts w:ascii="Arial" w:cs="Arial" w:eastAsia="Arial" w:hAnsi="Arial"/>
+                <w:b/>
+                <w:bCs/>
+                <w:sz w:val="20"/>
+                <w:szCs w:val="20"/>
+              </w:rPr>
+              <w:t xml:space="preserve">Try it: </w:t>
+            </w:r>
+            <w:r>
+              <w:rPr>
+                <w:rFonts w:ascii="Arial" w:cs="Arial" w:eastAsia="Arial" w:hAnsi="Arial"/>
+                <w:sz w:val="20"/>
+                <w:szCs w:val="20"/>
+              </w:rPr>
+              <w:t xml:space="preserve">Al-Biruni needed careful measuring. A rod is 10 cm long. A table is 6 rods long. How long is the table in cm?</w:t>
+            </w:r>
+          </w:p>
+          <w:p>
+            <w:pPr>
+              <w:keepLines/>
+              <w:spacing w:after="0" w:before="0" w:line="320" w:lineRule="auto"/>
+            </w:pPr>
+            <w:r>
+              <w:rPr>
+                <w:rFonts w:ascii="Arial" w:cs="Arial" w:eastAsia="Arial" w:hAnsi="Arial"/>
+                <w:b/>
+                <w:bCs/>
+                <w:sz w:val="20"/>
+                <w:szCs w:val="20"/>
+              </w:rPr>
+              <w:t xml:space="preserve">My answer: </w:t>
+            </w:r>
+            <w:r>
+              <w:rPr>
+                <w:rFonts w:ascii="Arial" w:cs="Arial" w:eastAsia="Arial" w:hAnsi="Arial"/>
+                <w:sz w:val="20"/>
+                <w:szCs w:val="20"/>
+              </w:rPr>
+              <w:t xml:space="preserve">______________________________</w:t>
+            </w:r>
+          </w:p>
+        </w:tc>
+      </w:tr>
+    </w:tbl>
+    <w:p>
+      <w:pPr>
+        <w:keepLines/>
         <w:pageBreakBefore/>
         <w:spacing w:after="60" w:before="0" w:line="320" w:lineRule="auto"/>
         <w:jc w:val="right"/>
@@ -37261,6 +38530,147 @@
                 <w:szCs w:val="19"/>
               </w:rPr>
               <w:t xml:space="preserve"> I would like to pass    </w:t>
+            </w:r>
+          </w:p>
+        </w:tc>
+      </w:tr>
+    </w:tbl>
+    <w:p>
+      <w:pPr>
+        <w:keepLines/>
+        <w:spacing w:after="60" w:before="0" w:line="320" w:lineRule="auto"/>
+      </w:pPr>
+      <w:r>
+        <w:rPr>
+          <w:rFonts w:ascii="Arial" w:cs="Arial" w:eastAsia="Arial" w:hAnsi="Arial"/>
+          <w:sz w:val="26"/>
+          <w:szCs w:val="26"/>
+        </w:rPr>
+        <w:t xml:space="preserve"/>
+      </w:r>
+    </w:p>
+    <w:tbl>
+      <w:tblPr>
+        <w:tblW w:type="dxa" w:w="9900"/>
+        <w:tblBorders>
+          <w:top w:val="single" w:color="auto" w:sz="4"/>
+          <w:left w:val="single" w:color="auto" w:sz="4"/>
+          <w:bottom w:val="single" w:color="auto" w:sz="4"/>
+          <w:right w:val="single" w:color="auto" w:sz="4"/>
+          <w:insideH w:val="single" w:color="auto" w:sz="4"/>
+          <w:insideV w:val="single" w:color="auto" w:sz="4"/>
+        </w:tblBorders>
+      </w:tblPr>
+      <w:tblGrid>
+        <w:gridCol w:w="9900"/>
+      </w:tblGrid>
+      <w:tr>
+        <w:trPr>
+          <w:cantSplit/>
+        </w:trPr>
+        <w:tc>
+          <w:tcPr>
+            <w:tcW w:type="dxa" w:w="9900"/>
+            <w:tcBorders>
+              <w:top w:val="single" w:color="000000" w:sz="8"/>
+              <w:left w:val="single" w:color="000000" w:sz="8"/>
+              <w:bottom w:val="single" w:color="000000" w:sz="8"/>
+              <w:right w:val="single" w:color="000000" w:sz="8"/>
+            </w:tcBorders>
+            <w:shd w:fill="FFF6D6" w:color="auto" w:val="clear"/>
+            <w:tcMar>
+              <w:top w:type="dxa" w:w="50"/>
+              <w:left w:type="dxa" w:w="100"/>
+              <w:bottom w:type="dxa" w:w="50"/>
+              <w:right w:type="dxa" w:w="100"/>
+            </w:tcMar>
+            <w:vAlign w:val="center"/>
+          </w:tcPr>
+          <w:p>
+            <w:pPr>
+              <w:keepLines/>
+              <w:spacing w:after="30" w:before="0" w:line="320" w:lineRule="auto"/>
+            </w:pPr>
+            <w:r>
+              <w:rPr>
+                <w:rFonts w:ascii="Arial" w:cs="Arial" w:eastAsia="Arial" w:hAnsi="Arial"/>
+                <w:b/>
+                <w:bCs/>
+                <w:color w:val="1F7A6F"/>
+                <w:sz w:val="22"/>
+                <w:szCs w:val="22"/>
+              </w:rPr>
+              <w:t xml:space="preserve">Story corner: Srinivasa Ramanujan  </w:t>
+            </w:r>
+            <w:r>
+              <w:rPr>
+                <w:rFonts w:ascii="Arial" w:cs="Arial" w:eastAsia="Arial" w:hAnsi="Arial"/>
+                <w:sz w:val="18"/>
+                <w:szCs w:val="18"/>
+              </w:rPr>
+              <w:t xml:space="preserve">Just for fun. You can pass.</w:t>
+            </w:r>
+          </w:p>
+          <w:p>
+            <w:pPr>
+              <w:keepLines/>
+              <w:spacing w:after="30" w:before="0" w:line="260" w:lineRule="auto"/>
+            </w:pPr>
+            <w:r>
+              <w:rPr>
+                <w:rFonts w:ascii="Arial" w:cs="Arial" w:eastAsia="Arial" w:hAnsi="Arial"/>
+                <w:sz w:val="20"/>
+                <w:szCs w:val="20"/>
+              </w:rPr>
+              <w:t xml:space="preserve">Srinivasa Ramanujan (India, 1887-1920) loved numbers and sent his ideas to mathematicians in England. He treated numbers like puzzles to explore.</w:t>
+            </w:r>
+          </w:p>
+          <w:p>
+            <w:pPr>
+              <w:keepLines/>
+              <w:spacing w:after="30" w:before="0" w:line="260" w:lineRule="auto"/>
+            </w:pPr>
+            <w:r>
+              <w:rPr>
+                <w:rFonts w:ascii="Arial" w:cs="Arial" w:eastAsia="Arial" w:hAnsi="Arial"/>
+                <w:b/>
+                <w:bCs/>
+                <w:sz w:val="20"/>
+                <w:szCs w:val="20"/>
+              </w:rPr>
+              <w:t xml:space="preserve">Try it: </w:t>
+            </w:r>
+            <w:r>
+              <w:rPr>
+                <w:rFonts w:ascii="Arial" w:cs="Arial" w:eastAsia="Arial" w:hAnsi="Arial"/>
+                <w:sz w:val="20"/>
+                <w:szCs w:val="20"/>
+              </w:rPr>
+              <w:t xml:space="preserve">Puzzle: find two numbers that add up to 12 and have a difference of 2.</w:t>
+            </w:r>
+          </w:p>
+          <w:p>
+            <w:pPr>
+              <w:keepLines/>
+              <w:spacing w:after="0" w:before="0" w:line="320" w:lineRule="auto"/>
+            </w:pPr>
+            <w:r>
+              <w:rPr>
+                <w:rFonts w:ascii="Arial" w:cs="Arial" w:eastAsia="Arial" w:hAnsi="Arial"/>
+                <w:b/>
+                <w:bCs/>
+                <w:sz w:val="20"/>
+                <w:szCs w:val="20"/>
+              </w:rPr>
+              <w:t xml:space="preserve">My answer: </w:t>
+            </w:r>
+            <w:r>
+              <w:rPr>
+                <w:rFonts w:ascii="Arial" w:cs="Arial" w:eastAsia="Arial" w:hAnsi="Arial"/>
+                <w:sz w:val="20"/>
+                <w:szCs w:val="20"/>
+              </w:rPr>
+              <w:t xml:space="preserve">______________________________</w:t>
             </w:r>
           </w:p>
         </w:tc>

</xml_diff>